<commit_message>
Premier commit : depandances
</commit_message>
<xml_diff>
--- a/Rapport_Segmentation_RFM.docx
+++ b/Rapport_Segmentation_RFM.docx
@@ -97,35 +97,7 @@
         <w:rPr>
           <w:rFonts w:ascii="Times New Roman" w:hAnsi="Times New Roman" w:cs="Times New Roman"/>
         </w:rPr>
-        <w:t>Une entreprise de vente en ligne souhaite mieux comprendre le comportement de ses clients, les segmenter selon leur valeur, et adapter ses stratégies marketing en conséquence. L'objectif de cette étude est de construire un modèle de clustering non supervisé basé sur la méthode RFM (</w:t>
-      </w:r>
-      <w:proofErr w:type="spellStart"/>
-      <w:r>
-        <w:rPr>
-          <w:rFonts w:ascii="Times New Roman" w:hAnsi="Times New Roman" w:cs="Times New Roman"/>
-        </w:rPr>
-        <w:t>Recency</w:t>
-      </w:r>
-      <w:proofErr w:type="spellEnd"/>
-      <w:r>
-        <w:rPr>
-          <w:rFonts w:ascii="Times New Roman" w:hAnsi="Times New Roman" w:cs="Times New Roman"/>
-        </w:rPr>
-        <w:t xml:space="preserve">, Frequency, </w:t>
-      </w:r>
-      <w:proofErr w:type="spellStart"/>
-      <w:r>
-        <w:rPr>
-          <w:rFonts w:ascii="Times New Roman" w:hAnsi="Times New Roman" w:cs="Times New Roman"/>
-        </w:rPr>
-        <w:t>Monetary</w:t>
-      </w:r>
-      <w:proofErr w:type="spellEnd"/>
-      <w:r>
-        <w:rPr>
-          <w:rFonts w:ascii="Times New Roman" w:hAnsi="Times New Roman" w:cs="Times New Roman"/>
-        </w:rPr>
-        <w:t>) afin d'identifier des profils clients homogènes.</w:t>
+        <w:t>Une entreprise de vente en ligne souhaite mieux comprendre le comportement de ses clients, les segmenter selon leur valeur, et adapter ses stratégies marketing en conséquence. L'objectif de cette étude est de construire un modèle de clustering non supervisé basé sur la méthode RFM (Recency, Frequency, Monetary) afin d'identifier des profils clients homogènes.</w:t>
       </w:r>
     </w:p>
     <w:p>
@@ -153,21 +125,7 @@
         <w:rPr>
           <w:rFonts w:ascii="Times New Roman" w:hAnsi="Times New Roman" w:cs="Times New Roman"/>
         </w:rPr>
-        <w:t xml:space="preserve">Le jeu de données (Online </w:t>
-      </w:r>
-      <w:proofErr w:type="spellStart"/>
-      <w:r>
-        <w:rPr>
-          <w:rFonts w:ascii="Times New Roman" w:hAnsi="Times New Roman" w:cs="Times New Roman"/>
-        </w:rPr>
-        <w:t>Retail</w:t>
-      </w:r>
-      <w:proofErr w:type="spellEnd"/>
-      <w:r>
-        <w:rPr>
-          <w:rFonts w:ascii="Times New Roman" w:hAnsi="Times New Roman" w:cs="Times New Roman"/>
-        </w:rPr>
-        <w:t>) contient l'historique des transactions d'une boutique en ligne britannique : numéro de facture, code produit, description, quantité, date de facturation, prix unitaire, identifiant client et pays. Après nettoyage (suppression des valeurs nulles, des doublons et des annulations de commande), la base exploitée compte environ 392 700 lignes de transactions réparties sur 4 338 clients uniques.</w:t>
+        <w:t>Le jeu de données (Online Retail) contient l'historique des transactions d'une boutique en ligne britannique : numéro de facture, code produit, description, quantité, date de facturation, prix unitaire, identifiant client et pays. Après nettoyage (suppression des valeurs nulles, des doublons et des annulations de commande), la base exploitée compte environ 392 700 lignes de transactions réparties sur 4 338 clients uniques.</w:t>
       </w:r>
     </w:p>
     <w:p>
@@ -209,19 +167,11 @@
           <w:rFonts w:ascii="Times New Roman" w:hAnsi="Times New Roman" w:cs="Times New Roman"/>
         </w:rPr>
       </w:pPr>
-      <w:proofErr w:type="spellStart"/>
-      <w:r>
-        <w:rPr>
-          <w:rFonts w:ascii="Times New Roman" w:hAnsi="Times New Roman" w:cs="Times New Roman"/>
-        </w:rPr>
-        <w:t>Recency</w:t>
-      </w:r>
-      <w:proofErr w:type="spellEnd"/>
-      <w:r>
-        <w:rPr>
-          <w:rFonts w:ascii="Times New Roman" w:hAnsi="Times New Roman" w:cs="Times New Roman"/>
-        </w:rPr>
-        <w:t xml:space="preserve"> : nombre de jours écoulés depuis le dernier achat du client</w:t>
+      <w:r>
+        <w:rPr>
+          <w:rFonts w:ascii="Times New Roman" w:hAnsi="Times New Roman" w:cs="Times New Roman"/>
+        </w:rPr>
+        <w:t>Recency : nombre de jours écoulés depuis le dernier achat du client</w:t>
       </w:r>
     </w:p>
     <w:p>
@@ -253,19 +203,11 @@
           <w:rFonts w:ascii="Times New Roman" w:hAnsi="Times New Roman" w:cs="Times New Roman"/>
         </w:rPr>
       </w:pPr>
-      <w:proofErr w:type="spellStart"/>
-      <w:r>
-        <w:rPr>
-          <w:rFonts w:ascii="Times New Roman" w:hAnsi="Times New Roman" w:cs="Times New Roman"/>
-        </w:rPr>
-        <w:t>Monetary</w:t>
-      </w:r>
-      <w:proofErr w:type="spellEnd"/>
-      <w:r>
-        <w:rPr>
-          <w:rFonts w:ascii="Times New Roman" w:hAnsi="Times New Roman" w:cs="Times New Roman"/>
-        </w:rPr>
-        <w:t xml:space="preserve"> : montant total dépensé par le client sur l'ensemble de son historique</w:t>
+      <w:r>
+        <w:rPr>
+          <w:rFonts w:ascii="Times New Roman" w:hAnsi="Times New Roman" w:cs="Times New Roman"/>
+        </w:rPr>
+        <w:t>Monetary : montant total dépensé par le client sur l'ensemble de son historique</w:t>
       </w:r>
     </w:p>
     <w:p>
@@ -293,35 +235,7 @@
         <w:rPr>
           <w:rFonts w:ascii="Times New Roman" w:hAnsi="Times New Roman" w:cs="Times New Roman"/>
         </w:rPr>
-        <w:t>Les variables RFM ont été normalisées (</w:t>
-      </w:r>
-      <w:proofErr w:type="spellStart"/>
-      <w:r>
-        <w:rPr>
-          <w:rFonts w:ascii="Times New Roman" w:hAnsi="Times New Roman" w:cs="Times New Roman"/>
-        </w:rPr>
-        <w:t>StandardScaler</w:t>
-      </w:r>
-      <w:proofErr w:type="spellEnd"/>
-      <w:r>
-        <w:rPr>
-          <w:rFonts w:ascii="Times New Roman" w:hAnsi="Times New Roman" w:cs="Times New Roman"/>
-        </w:rPr>
-        <w:t>) avant d'appliquer l'algorithme K-Means. Le nombre optimal de clusters a été déterminé à l'aide de la méthode du coude (</w:t>
-      </w:r>
-      <w:proofErr w:type="spellStart"/>
-      <w:r>
-        <w:rPr>
-          <w:rFonts w:ascii="Times New Roman" w:hAnsi="Times New Roman" w:cs="Times New Roman"/>
-        </w:rPr>
-        <w:t>Elbow</w:t>
-      </w:r>
-      <w:proofErr w:type="spellEnd"/>
-      <w:r>
-        <w:rPr>
-          <w:rFonts w:ascii="Times New Roman" w:hAnsi="Times New Roman" w:cs="Times New Roman"/>
-        </w:rPr>
-        <w:t xml:space="preserve"> Method) et confirmé par le score de silhouette, ce qui a conduit à retenir k = 4 segments. Un clustering DBSCAN a également été testé en complément (cf. section 4).</w:t>
+        <w:t>Les variables RFM ont été normalisées (StandardScaler) avant d'appliquer l'algorithme K-Means. Le nombre optimal de clusters a été déterminé à l'aide de la méthode du coude (Elbow Method) et confirmé par le score de silhouette, ce qui a conduit à retenir k = 4 segments. Un clustering DBSCAN a également été testé en complément (cf. section 4).</w:t>
       </w:r>
     </w:p>
     <w:p>
@@ -474,7 +388,6 @@
                 <w:rFonts w:ascii="Times New Roman" w:hAnsi="Times New Roman" w:cs="Times New Roman"/>
               </w:rPr>
             </w:pPr>
-            <w:proofErr w:type="spellStart"/>
             <w:r>
               <w:rPr>
                 <w:rFonts w:ascii="Times New Roman" w:hAnsi="Times New Roman" w:cs="Times New Roman"/>
@@ -482,37 +395,7 @@
                 <w:bCs/>
                 <w:color w:val="FFFFFF"/>
               </w:rPr>
-              <w:t>Recency</w:t>
-            </w:r>
-            <w:proofErr w:type="spellEnd"/>
-            <w:r>
-              <w:rPr>
-                <w:rFonts w:ascii="Times New Roman" w:hAnsi="Times New Roman" w:cs="Times New Roman"/>
-                <w:b/>
-                <w:bCs/>
-                <w:color w:val="FFFFFF"/>
-              </w:rPr>
-              <w:t xml:space="preserve"> </w:t>
-            </w:r>
-            <w:proofErr w:type="spellStart"/>
-            <w:r>
-              <w:rPr>
-                <w:rFonts w:ascii="Times New Roman" w:hAnsi="Times New Roman" w:cs="Times New Roman"/>
-                <w:b/>
-                <w:bCs/>
-                <w:color w:val="FFFFFF"/>
-              </w:rPr>
-              <w:t>moy</w:t>
-            </w:r>
-            <w:proofErr w:type="spellEnd"/>
-            <w:r>
-              <w:rPr>
-                <w:rFonts w:ascii="Times New Roman" w:hAnsi="Times New Roman" w:cs="Times New Roman"/>
-                <w:b/>
-                <w:bCs/>
-                <w:color w:val="FFFFFF"/>
-              </w:rPr>
-              <w:t>.</w:t>
+              <w:t>Recency moy.</w:t>
             </w:r>
           </w:p>
         </w:tc>
@@ -546,27 +429,7 @@
                 <w:bCs/>
                 <w:color w:val="FFFFFF"/>
               </w:rPr>
-              <w:t xml:space="preserve">Frequency </w:t>
-            </w:r>
-            <w:proofErr w:type="spellStart"/>
-            <w:r>
-              <w:rPr>
-                <w:rFonts w:ascii="Times New Roman" w:hAnsi="Times New Roman" w:cs="Times New Roman"/>
-                <w:b/>
-                <w:bCs/>
-                <w:color w:val="FFFFFF"/>
-              </w:rPr>
-              <w:t>moy</w:t>
-            </w:r>
-            <w:proofErr w:type="spellEnd"/>
-            <w:r>
-              <w:rPr>
-                <w:rFonts w:ascii="Times New Roman" w:hAnsi="Times New Roman" w:cs="Times New Roman"/>
-                <w:b/>
-                <w:bCs/>
-                <w:color w:val="FFFFFF"/>
-              </w:rPr>
-              <w:t>.</w:t>
+              <w:t>Frequency moy.</w:t>
             </w:r>
           </w:p>
         </w:tc>
@@ -593,7 +456,6 @@
                 <w:rFonts w:ascii="Times New Roman" w:hAnsi="Times New Roman" w:cs="Times New Roman"/>
               </w:rPr>
             </w:pPr>
-            <w:proofErr w:type="spellStart"/>
             <w:r>
               <w:rPr>
                 <w:rFonts w:ascii="Times New Roman" w:hAnsi="Times New Roman" w:cs="Times New Roman"/>
@@ -601,37 +463,7 @@
                 <w:bCs/>
                 <w:color w:val="FFFFFF"/>
               </w:rPr>
-              <w:t>Monetary</w:t>
-            </w:r>
-            <w:proofErr w:type="spellEnd"/>
-            <w:r>
-              <w:rPr>
-                <w:rFonts w:ascii="Times New Roman" w:hAnsi="Times New Roman" w:cs="Times New Roman"/>
-                <w:b/>
-                <w:bCs/>
-                <w:color w:val="FFFFFF"/>
-              </w:rPr>
-              <w:t xml:space="preserve"> </w:t>
-            </w:r>
-            <w:proofErr w:type="spellStart"/>
-            <w:r>
-              <w:rPr>
-                <w:rFonts w:ascii="Times New Roman" w:hAnsi="Times New Roman" w:cs="Times New Roman"/>
-                <w:b/>
-                <w:bCs/>
-                <w:color w:val="FFFFFF"/>
-              </w:rPr>
-              <w:t>moy</w:t>
-            </w:r>
-            <w:proofErr w:type="spellEnd"/>
-            <w:r>
-              <w:rPr>
-                <w:rFonts w:ascii="Times New Roman" w:hAnsi="Times New Roman" w:cs="Times New Roman"/>
-                <w:b/>
-                <w:bCs/>
-                <w:color w:val="FFFFFF"/>
-              </w:rPr>
-              <w:t>. (€)</w:t>
+              <w:t>Monetary moy. (€)</w:t>
             </w:r>
           </w:p>
         </w:tc>
@@ -1517,21 +1349,7 @@
         <w:rPr>
           <w:rFonts w:ascii="Times New Roman" w:hAnsi="Times New Roman" w:cs="Times New Roman"/>
         </w:rPr>
-        <w:t xml:space="preserve">Clustering hiérarchique : testé via </w:t>
-      </w:r>
-      <w:proofErr w:type="spellStart"/>
-      <w:r>
-        <w:rPr>
-          <w:rFonts w:ascii="Times New Roman" w:hAnsi="Times New Roman" w:cs="Times New Roman"/>
-        </w:rPr>
-        <w:t>AgglomerativeClustering</w:t>
-      </w:r>
-      <w:proofErr w:type="spellEnd"/>
-      <w:r>
-        <w:rPr>
-          <w:rFonts w:ascii="Times New Roman" w:hAnsi="Times New Roman" w:cs="Times New Roman"/>
-        </w:rPr>
-        <w:t xml:space="preserve"> et dendrogramme, avec un score de silhouette proche de celui de K-Means, confirmant la cohérence du découpage en 4 segments.</w:t>
+        <w:t>Clustering hiérarchique : testé via AgglomerativeClustering et dendrogramme, avec un score de silhouette proche de celui de K-Means, confirmant la cohérence du découpage en 4 segments.</w:t>
       </w:r>
     </w:p>
     <w:p>
@@ -1549,21 +1367,7 @@
         <w:rPr>
           <w:rFonts w:ascii="Times New Roman" w:hAnsi="Times New Roman" w:cs="Times New Roman"/>
         </w:rPr>
-        <w:t xml:space="preserve">Application </w:t>
-      </w:r>
-      <w:proofErr w:type="spellStart"/>
-      <w:r>
-        <w:rPr>
-          <w:rFonts w:ascii="Times New Roman" w:hAnsi="Times New Roman" w:cs="Times New Roman"/>
-        </w:rPr>
-        <w:t>Streamlit</w:t>
-      </w:r>
-      <w:proofErr w:type="spellEnd"/>
-      <w:r>
-        <w:rPr>
-          <w:rFonts w:ascii="Times New Roman" w:hAnsi="Times New Roman" w:cs="Times New Roman"/>
-        </w:rPr>
-        <w:t xml:space="preserve"> : développée pour permettre la visualisation interactive des segments et la prédiction en temps réel du segment d'un nouveau client à partir de ses valeurs RFM.</w:t>
+        <w:t>Application Streamlit : développée pour permettre la visualisation interactive des segments et la prédiction en temps réel du segment d'un nouveau client à partir de ses valeurs RFM.</w:t>
       </w:r>
     </w:p>
     <w:p>
@@ -1599,35 +1403,43 @@
         <w:rPr>
           <w:rFonts w:ascii="Times New Roman" w:hAnsi="Times New Roman" w:cs="Times New Roman"/>
         </w:rPr>
-        <w:t xml:space="preserve">L'analyse RFM couplée au clustering K-Means a permis d'identifier 4 segments clients exploitables par les équipes marketing : des clients premium et fidèles à fort potentiel à fidéliser, une base importante de clients occasionnels à développer, et des clients à risque de </w:t>
-      </w:r>
-      <w:proofErr w:type="spellStart"/>
-      <w:r>
-        <w:rPr>
-          <w:rFonts w:ascii="Times New Roman" w:hAnsi="Times New Roman" w:cs="Times New Roman"/>
-        </w:rPr>
-        <w:t>churn</w:t>
-      </w:r>
-      <w:proofErr w:type="spellEnd"/>
-      <w:r>
-        <w:rPr>
-          <w:rFonts w:ascii="Times New Roman" w:hAnsi="Times New Roman" w:cs="Times New Roman"/>
-        </w:rPr>
-        <w:t xml:space="preserve"> à réactiver. L'application </w:t>
-      </w:r>
-      <w:proofErr w:type="spellStart"/>
-      <w:r>
-        <w:rPr>
-          <w:rFonts w:ascii="Times New Roman" w:hAnsi="Times New Roman" w:cs="Times New Roman"/>
-        </w:rPr>
-        <w:t>Streamlit</w:t>
-      </w:r>
-      <w:proofErr w:type="spellEnd"/>
-      <w:r>
-        <w:rPr>
-          <w:rFonts w:ascii="Times New Roman" w:hAnsi="Times New Roman" w:cs="Times New Roman"/>
-        </w:rPr>
-        <w:t xml:space="preserve"> développée permet désormais à l'entreprise d'exploiter ce modèle de manière opérationnelle, en visualisant les segments existants et en prédisant le segment de tout nouveau client.</w:t>
+        <w:t>L'analyse RFM couplée au clustering K-Means a permis d'identifier 4 segments clients exploitables par les équipes marketing : des clients premium et fidèles à fort potentiel à fidéliser, une base importante de clients occasionnels à développer, et des clients à risque de churn à réactiver. L'application Streamlit développée permet désormais à l'entreprise d'exploiter ce modèle de manière opérationnelle, en visualisant les segments existants et en prédisant le segment de tout nouveau client.</w:t>
+      </w:r>
+    </w:p>
+    <w:p>
+      <w:pPr>
+        <w:spacing w:after="120"/>
+        <w:rPr>
+          <w:rFonts w:ascii="Times New Roman" w:hAnsi="Times New Roman" w:cs="Times New Roman"/>
+        </w:rPr>
+      </w:pPr>
+    </w:p>
+    <w:p>
+      <w:pPr>
+        <w:spacing w:after="120"/>
+        <w:rPr>
+          <w:rFonts w:ascii="Times New Roman" w:hAnsi="Times New Roman" w:cs="Times New Roman"/>
+        </w:rPr>
+      </w:pPr>
+    </w:p>
+    <w:p>
+      <w:pPr>
+        <w:spacing w:after="120"/>
+        <w:rPr>
+          <w:rFonts w:ascii="Times New Roman" w:hAnsi="Times New Roman" w:cs="Times New Roman"/>
+        </w:rPr>
+      </w:pPr>
+      <w:r>
+        <w:rPr>
+          <w:rFonts w:ascii="Times New Roman" w:hAnsi="Times New Roman" w:cs="Times New Roman"/>
+        </w:rPr>
+        <w:t xml:space="preserve">Lien de l’application : </w:t>
+      </w:r>
+      <w:r>
+        <w:rPr>
+          <w:rFonts w:ascii="Times New Roman" w:hAnsi="Times New Roman" w:cs="Times New Roman"/>
+        </w:rPr>
+        <w:t>https://segmentationsessionnormale.streamlit.app/</w:t>
       </w:r>
     </w:p>
     <w:sectPr>

</xml_diff>